<commit_message>
fix: complete daily review release behavior
</commit_message>
<xml_diff>
--- a/한국 지역 이름 맞추기 - 게임물내용설명서.docx
+++ b/한국 지역 이름 맞추기 - 게임물내용설명서.docx
@@ -421,7 +421,7 @@
           </w:tcPr>
           <w:p>
             <w:r>
-              <w:t>2026년 9월 16일</w:t>
+              <w:t>2026년 9월 20일</w:t>
             </w:r>
           </w:p>
         </w:tc>
@@ -2986,7 +2986,7 @@
           <w:sz w:val="21"/>
           <w:szCs w:val="21"/>
         </w:rPr>
-        <w:t xml:space="preserve">오답이 발생한 경우 정규 코스 뒤에 최대 2개의 </w:t>
+        <w:t xml:space="preserve">오답이 발생한 경우 정규 코스 뒤에 최대 2개의 확인 문제가 추가된다. 확인 문제는 학습을 위한 재노출 문항으로 XP, 하트, 정답 수 및 숙련도에 영향을 주지 않는다. 홈의 오늘의 복습은 복습 예정일이 오래 지난 지역부터 최대 5개만 출제하며, 대상이 5개 미만이면 있는 지역만 출제한다. 최초 오답 지역은 다른 문제 뒤에 다시 출제하고 지역별 최대 5회까지 시도한다. 5번째 시도에서는 정답 지역 선택을 안내한다.</w:t>
       </w:r>
       <w:r>
         <w:rPr>
@@ -2996,7 +2996,7 @@
           <w:sz w:val="21"/>
           <w:szCs w:val="21"/>
         </w:rPr>
-        <w:t>확인 문제</w:t>
+        <w:t/>
       </w:r>
       <w:r>
         <w:rPr>
@@ -3005,7 +3005,7 @@
           <w:sz w:val="21"/>
           <w:szCs w:val="21"/>
         </w:rPr>
-        <w:t>가 추가된다. 확인 문제는 학습을 위한 재노출 문항으로 XP, 하트, 정답 수 및 숙련도에 영향을 주지 않는다.</w:t>
+        <w:t/>
       </w:r>
     </w:p>
     <w:p>
@@ -5802,7 +5802,7 @@
           <w:sz w:val="21"/>
           <w:szCs w:val="21"/>
         </w:rPr>
-        <w:t xml:space="preserve">5문제를 모두 연속으로 맞힐 경우 획득 XP는 </w:t>
+        <w:t xml:space="preserve">일반 코스에서 5문제를 모두 연속으로 맞힐 경우 획득 XP는 10 + 10 + 15 + 15 + 15 = 65 XP이다. 오늘의 복습에서는 최초 정답에 10 XP, 오답 뒤 재출제 정답에 5 XP를 지급하며 콤보 보너스는 적용하지 않는다. XP는 게임 내 성취 표시용 수치이며 현금, 유료 재화, 경품 또는 외부 혜택으로 교환할 수 없다.</w:t>
       </w:r>
       <w:r>
         <w:rPr>
@@ -5812,7 +5812,7 @@
           <w:sz w:val="21"/>
           <w:szCs w:val="21"/>
         </w:rPr>
-        <w:t>10 + 10 + 15 + 15 + 15 = 65 XP</w:t>
+        <w:t/>
       </w:r>
       <w:r>
         <w:rPr>
@@ -5821,7 +5821,7 @@
           <w:sz w:val="21"/>
           <w:szCs w:val="21"/>
         </w:rPr>
-        <w:t>이다. XP는 게임 내 성취 표시용 수치이며 현금, 유료 재화, 경품 또는 외부 혜택으로 교환할 수 없다.</w:t>
+        <w:t/>
       </w:r>
     </w:p>
     <w:p>
@@ -5885,7 +5885,7 @@
           <w:sz w:val="21"/>
           <w:szCs w:val="21"/>
         </w:rPr>
-        <w:t>코스 시작 시 하트 3개가 표시된다. 채점 문제에서 오답을 제출하면 하트가 1개 감소하며 0 아래로 내려가지 않는다. 현재 빌드에서 하트가 0이 되어도 코스는 강제로 종료되지 않고 남은 문제를 계속 풀 수 있다. 하트는 오답 횟수를 직관적으로 보여 주는 상태 표시이며 구매하거나 충전하는 유료 아이템이 아니다.</w:t>
+        <w:t>코스 시작 시 하트 3개가 표시된다. 채점 문제에서 오답을 제출하면 하트가 1개 감소하며 0 아래로 내려가지 않는다. 오늘의 복습에서 정답을 맞히면 하트가 1개 회복되며 최대 3개를 넘지 않는다. 하트가 이미 3개이면 XP만 지급한다. 하트가 0이 되어도 코스는 강제로 종료되지 않고 남은 문제를 계속 풀 수 있다. 하트는 구매하거나 유료로 충전하는 게임 아이템이 아니다.</w:t>
       </w:r>
     </w:p>
     <w:p>
@@ -6020,7 +6020,7 @@
           <w:sz w:val="21"/>
           <w:szCs w:val="21"/>
         </w:rPr>
-        <w:t xml:space="preserve">숙련도별 권장 복습 간격은 1일, 3일, 7일, 21일 순서로 늘어난다. 복습 시점이 되면 홈 화면의 </w:t>
+        <w:t xml:space="preserve">숙련도별 권장 복습 간격은 1일, 3일, 7일, 14일 순서로 늘어난다. 날짜는 이용 기기의 현지 자정을 기준으로 계산하며, 복습 시점이 되면 홈 화면의 오늘의 복습 영역에 대상 지역이 표시된다. 오늘의 복습에서는 서로 다른 현지 날짜에 2회 연속 정답이면 한 단계 상승하고, 2회 연속 오답이면 한 단계 하락한다. 최초 오답과 같은 세션의 교정 성공은 별도로 기록하며 교정 성공이 최초 결과를 덮어쓰지 않는다.</w:t>
       </w:r>
       <w:r>
         <w:rPr>
@@ -6030,7 +6030,7 @@
           <w:sz w:val="21"/>
           <w:szCs w:val="21"/>
         </w:rPr>
-        <w:t>오늘의 복습</w:t>
+        <w:t/>
       </w:r>
       <w:r>
         <w:rPr>
@@ -6039,7 +6039,7 @@
           <w:sz w:val="21"/>
           <w:szCs w:val="21"/>
         </w:rPr>
-        <w:t xml:space="preserve"> 영역에 대상 지역이 표시된다.</w:t>
+        <w:t xml:space="preserve"/>
       </w:r>
     </w:p>
     <w:p>
@@ -6361,7 +6361,7 @@
                 <w:sz w:val="18"/>
                 <w:szCs w:val="18"/>
               </w:rPr>
-              <w:t>현재 코스의 오답 상태 표시</w:t>
+              <w:t>현재 하트 수 및 복습 정답 회복 표시</w:t>
             </w:r>
           </w:p>
         </w:tc>
@@ -6445,7 +6445,7 @@
                 <w:sz w:val="18"/>
                 <w:szCs w:val="18"/>
               </w:rPr>
-              <w:t>오답 시 감소</w:t>
+              <w:t>오답 시 감소, 복습 정답 시 회복</w:t>
             </w:r>
           </w:p>
         </w:tc>
@@ -13516,7 +13516,7 @@
     </w:p>
     <w:p>
       <w:r>
-        <w:t>2026년 9월 16일 배포용 빌드 결과를 기준으로 산정하였다.</w:t>
+        <w:t>2026년 9월 20일 배포용 빌드 결과를 기준으로 산정하였다.</w:t>
       </w:r>
     </w:p>
     <w:tbl>
@@ -13605,7 +13605,7 @@
           </w:tcPr>
           <w:p>
             <w:r>
-              <w:t>894,427바이트(약 0.89MB)</w:t>
+              <w:t>899,319바이트(약 0.90MB)</w:t>
             </w:r>
           </w:p>
         </w:tc>
@@ -13645,7 +13645,7 @@
           </w:tcPr>
           <w:p>
             <w:r>
-              <w:t>413,793바이트(약 0.41MB)</w:t>
+              <w:t>414,925바이트(약 0.41MB)</w:t>
             </w:r>
           </w:p>
         </w:tc>

</xml_diff>